<commit_message>
Trim LayoutLM to 6 questions, landing page demo-only, 16 to 6 claims aligned everywhere
</commit_message>
<xml_diff>
--- a/docs/doclens_technical_documentation.docx
+++ b/docs/doclens_technical_documentation.docx
@@ -369,7 +369,7 @@
     </w:p>
     <w:p>
       <w:r>
-        <w:t>This document describes the design, implementation, and evaluation of DocLens: a full-stack web application that classifies document images into four categories and extracts sixteen structured fields from any document classified as an invoice. The entire system was built under a hard constraint — no generative AI — using traditional machine learning, classical feature engineering, and a discriminative (span-selection) transformer for document question answering.</w:t>
+        <w:t>This document describes the design, implementation, and evaluation of DocLens: a full-stack web application that classifies document images into four categories and extracts six structured fields from any document classified as an invoice. The entire system was built under a hard constraint — no generative AI — using traditional machine learning, classical feature engineering, and a discriminative (span-selection) transformer for document question answering.</w:t>
       </w:r>
     </w:p>
     <w:p>
@@ -1204,7 +1204,7 @@
         <w:t xml:space="preserve">4.  </w:t>
       </w:r>
       <w:r>
-        <w:t>The original (un-preprocessed) image is passed to LayoutLMv2. For each of the sixteen target fields, the model is asked a targeted natural-language question and returns the span of the document that answers it, along with a confidence score. Answers below a minimum score threshold are discarded.</w:t>
+        <w:t>The original (un-preprocessed) image is passed to LayoutLMv2. For each of the six target fields, the model is asked a targeted natural-language question and returns the span of the document that answers it, along with a confidence score. Answers below a minimum score threshold are discarded.</w:t>
       </w:r>
     </w:p>
     <w:p>
@@ -1218,7 +1218,7 @@
         <w:t xml:space="preserve">5.  </w:t>
       </w:r>
       <w:r>
-        <w:t>An InvoiceExtraction row is written with all sixteen field values, date-parsed timestamps, a normalised total amount, an inferred currency, the raw OCR text, and a per-field confidence map. The Document status is set to 'done'.</w:t>
+        <w:t>An InvoiceExtraction row is written with all six field values, date-parsed timestamps, a normalised total amount, an inferred currency, the raw OCR text, and a per-field confidence map. The Document status is set to 'done'.</w:t>
       </w:r>
     </w:p>
     <w:p>
@@ -3195,7 +3195,7 @@
     </w:p>
     <w:p>
       <w:r>
-        <w:t>The extraction pipeline has two distinct phases. First, the image is preprocessed to maximise OCR quality — but the preprocessed image is used only for the raw_text log, not for the actual field extraction. Second, the original (un-preprocessed) image is passed to LayoutLMv2, which performs its own internal OCR while simultaneously reading the spatial layout of the document. For each of sixteen target fields, LayoutLM is asked a targeted natural-language question and returns the span of the document that answers it, along with a confidence score.</w:t>
+        <w:t>The extraction pipeline has two distinct phases. First, the image is preprocessed to maximise OCR quality — but the preprocessed image is used only for the raw_text log, not for the actual field extraction. Second, the original (un-preprocessed) image is passed to LayoutLMv2, which performs its own internal OCR while simultaneously reading the spatial layout of the document. For each of six target fields, LayoutLM is asked a targeted natural-language question and returns the span of the document that answers it, along with a confidence score.</w:t>
       </w:r>
     </w:p>
     <w:p>
@@ -3280,7 +3280,7 @@
     </w:p>
     <w:p>
       <w:r>
-        <w:t>For each of the sixteen target fields, we ask one or two targeted natural-language questions. LayoutLM returns the best answer span and a confidence score. Answers below a minimum confidence threshold are discarded, leaving the field null.</w:t>
+        <w:t>For each of the six target fields, we ask one or two targeted natural-language questions. LayoutLM returns the best answer span and a confidence score. Answers below a minimum confidence threshold are discarded, leaving the field null.</w:t>
       </w:r>
     </w:p>
     <w:p>
@@ -3497,7 +3497,7 @@
                 <w:rFonts w:ascii="Times New Roman" w:hAnsi="Times New Roman"/>
                 <w:sz w:val="22"/>
               </w:rPr>
-              <w:t>Client_Name</w:t>
+              <w:t>Recipient_Name</w:t>
             </w:r>
           </w:p>
         </w:tc>
@@ -3529,7 +3529,7 @@
                 <w:rFonts w:ascii="Times New Roman" w:hAnsi="Times New Roman"/>
                 <w:sz w:val="22"/>
               </w:rPr>
-              <w:t>Client_Email</w:t>
+              <w:t>Total_Amount</w:t>
             </w:r>
           </w:p>
         </w:tc>
@@ -3544,327 +3544,7 @@
                 <w:rFonts w:ascii="Times New Roman" w:hAnsi="Times New Roman"/>
                 <w:sz w:val="22"/>
               </w:rPr>
-              <w:t>What is the client email address?</w:t>
-            </w:r>
-          </w:p>
-        </w:tc>
-      </w:tr>
-      <w:tr>
-        <w:tc>
-          <w:tcPr>
-            <w:tcW w:type="dxa" w:w="2268"/>
-          </w:tcPr>
-          <w:p>
-            <w:r/>
-            <w:r>
-              <w:rPr>
-                <w:rFonts w:ascii="Times New Roman" w:hAnsi="Times New Roman"/>
-                <w:sz w:val="22"/>
-              </w:rPr>
-              <w:t>Client_Phone</w:t>
-            </w:r>
-          </w:p>
-        </w:tc>
-        <w:tc>
-          <w:tcPr>
-            <w:tcW w:type="dxa" w:w="6803"/>
-          </w:tcPr>
-          <w:p>
-            <w:r/>
-            <w:r>
-              <w:rPr>
-                <w:rFonts w:ascii="Times New Roman" w:hAnsi="Times New Roman"/>
-                <w:sz w:val="22"/>
-              </w:rPr>
-              <w:t>What is the client phone number?</w:t>
-            </w:r>
-          </w:p>
-        </w:tc>
-      </w:tr>
-      <w:tr>
-        <w:tc>
-          <w:tcPr>
-            <w:tcW w:type="dxa" w:w="2268"/>
-          </w:tcPr>
-          <w:p>
-            <w:r/>
-            <w:r>
-              <w:rPr>
-                <w:rFonts w:ascii="Times New Roman" w:hAnsi="Times New Roman"/>
-                <w:sz w:val="22"/>
-              </w:rPr>
-              <w:t>Billing_Address</w:t>
-            </w:r>
-          </w:p>
-        </w:tc>
-        <w:tc>
-          <w:tcPr>
-            <w:tcW w:type="dxa" w:w="6803"/>
-          </w:tcPr>
-          <w:p>
-            <w:r/>
-            <w:r>
-              <w:rPr>
-                <w:rFonts w:ascii="Times New Roman" w:hAnsi="Times New Roman"/>
-                <w:sz w:val="22"/>
-              </w:rPr>
-              <w:t>What is the billing address?</w:t>
-            </w:r>
-          </w:p>
-        </w:tc>
-      </w:tr>
-      <w:tr>
-        <w:tc>
-          <w:tcPr>
-            <w:tcW w:type="dxa" w:w="2268"/>
-          </w:tcPr>
-          <w:p>
-            <w:r/>
-            <w:r>
-              <w:rPr>
-                <w:rFonts w:ascii="Times New Roman" w:hAnsi="Times New Roman"/>
-                <w:sz w:val="22"/>
-              </w:rPr>
-              <w:t>Shipping_Address</w:t>
-            </w:r>
-          </w:p>
-        </w:tc>
-        <w:tc>
-          <w:tcPr>
-            <w:tcW w:type="dxa" w:w="6803"/>
-          </w:tcPr>
-          <w:p>
-            <w:r/>
-            <w:r>
-              <w:rPr>
-                <w:rFonts w:ascii="Times New Roman" w:hAnsi="Times New Roman"/>
-                <w:sz w:val="22"/>
-              </w:rPr>
-              <w:t>What is the shipping or delivery address?</w:t>
-            </w:r>
-          </w:p>
-        </w:tc>
-      </w:tr>
-      <w:tr>
-        <w:tc>
-          <w:tcPr>
-            <w:tcW w:type="dxa" w:w="2268"/>
-          </w:tcPr>
-          <w:p>
-            <w:r/>
-            <w:r>
-              <w:rPr>
-                <w:rFonts w:ascii="Times New Roman" w:hAnsi="Times New Roman"/>
-                <w:sz w:val="22"/>
-              </w:rPr>
-              <w:t>Products</w:t>
-            </w:r>
-          </w:p>
-        </w:tc>
-        <w:tc>
-          <w:tcPr>
-            <w:tcW w:type="dxa" w:w="6803"/>
-          </w:tcPr>
-          <w:p>
-            <w:r/>
-            <w:r>
-              <w:rPr>
-                <w:rFonts w:ascii="Times New Roman" w:hAnsi="Times New Roman"/>
-                <w:sz w:val="22"/>
-              </w:rPr>
-              <w:t>What are the products or items listed on the invoice?</w:t>
-            </w:r>
-          </w:p>
-        </w:tc>
-      </w:tr>
-      <w:tr>
-        <w:tc>
-          <w:tcPr>
-            <w:tcW w:type="dxa" w:w="2268"/>
-          </w:tcPr>
-          <w:p>
-            <w:r/>
-            <w:r>
-              <w:rPr>
-                <w:rFonts w:ascii="Times New Roman" w:hAnsi="Times New Roman"/>
-                <w:sz w:val="22"/>
-              </w:rPr>
-              <w:t>Subtotal</w:t>
-            </w:r>
-          </w:p>
-        </w:tc>
-        <w:tc>
-          <w:tcPr>
-            <w:tcW w:type="dxa" w:w="6803"/>
-          </w:tcPr>
-          <w:p>
-            <w:r/>
-            <w:r>
-              <w:rPr>
-                <w:rFonts w:ascii="Times New Roman" w:hAnsi="Times New Roman"/>
-                <w:sz w:val="22"/>
-              </w:rPr>
-              <w:t>What is the subtotal amount?</w:t>
-            </w:r>
-          </w:p>
-        </w:tc>
-      </w:tr>
-      <w:tr>
-        <w:tc>
-          <w:tcPr>
-            <w:tcW w:type="dxa" w:w="2268"/>
-          </w:tcPr>
-          <w:p>
-            <w:r/>
-            <w:r>
-              <w:rPr>
-                <w:rFonts w:ascii="Times New Roman" w:hAnsi="Times New Roman"/>
-                <w:sz w:val="22"/>
-              </w:rPr>
-              <w:t>VAT</w:t>
-            </w:r>
-          </w:p>
-        </w:tc>
-        <w:tc>
-          <w:tcPr>
-            <w:tcW w:type="dxa" w:w="6803"/>
-          </w:tcPr>
-          <w:p>
-            <w:r/>
-            <w:r>
-              <w:rPr>
-                <w:rFonts w:ascii="Times New Roman" w:hAnsi="Times New Roman"/>
-                <w:sz w:val="22"/>
-              </w:rPr>
-              <w:t>What is the VAT or tax amount?</w:t>
-            </w:r>
-          </w:p>
-        </w:tc>
-      </w:tr>
-      <w:tr>
-        <w:tc>
-          <w:tcPr>
-            <w:tcW w:type="dxa" w:w="2268"/>
-          </w:tcPr>
-          <w:p>
-            <w:r/>
-            <w:r>
-              <w:rPr>
-                <w:rFonts w:ascii="Times New Roman" w:hAnsi="Times New Roman"/>
-                <w:sz w:val="22"/>
-              </w:rPr>
-              <w:t>VAT_Rate</w:t>
-            </w:r>
-          </w:p>
-        </w:tc>
-        <w:tc>
-          <w:tcPr>
-            <w:tcW w:type="dxa" w:w="6803"/>
-          </w:tcPr>
-          <w:p>
-            <w:r/>
-            <w:r>
-              <w:rPr>
-                <w:rFonts w:ascii="Times New Roman" w:hAnsi="Times New Roman"/>
-                <w:sz w:val="22"/>
-              </w:rPr>
-              <w:t>What is the VAT rate or tax rate?</w:t>
-            </w:r>
-          </w:p>
-        </w:tc>
-      </w:tr>
-      <w:tr>
-        <w:tc>
-          <w:tcPr>
-            <w:tcW w:type="dxa" w:w="2268"/>
-          </w:tcPr>
-          <w:p>
-            <w:r/>
-            <w:r>
-              <w:rPr>
-                <w:rFonts w:ascii="Times New Roman" w:hAnsi="Times New Roman"/>
-                <w:sz w:val="22"/>
-              </w:rPr>
-              <w:t>Total</w:t>
-            </w:r>
-          </w:p>
-        </w:tc>
-        <w:tc>
-          <w:tcPr>
-            <w:tcW w:type="dxa" w:w="6803"/>
-          </w:tcPr>
-          <w:p>
-            <w:r/>
-            <w:r>
-              <w:rPr>
-                <w:rFonts w:ascii="Times New Roman" w:hAnsi="Times New Roman"/>
-                <w:sz w:val="22"/>
-              </w:rPr>
               <w:t>What is the total amount due? / What is the total?</w:t>
-            </w:r>
-          </w:p>
-        </w:tc>
-      </w:tr>
-      <w:tr>
-        <w:tc>
-          <w:tcPr>
-            <w:tcW w:type="dxa" w:w="2268"/>
-          </w:tcPr>
-          <w:p>
-            <w:r/>
-            <w:r>
-              <w:rPr>
-                <w:rFonts w:ascii="Times New Roman" w:hAnsi="Times New Roman"/>
-                <w:sz w:val="22"/>
-              </w:rPr>
-              <w:t>Discount</w:t>
-            </w:r>
-          </w:p>
-        </w:tc>
-        <w:tc>
-          <w:tcPr>
-            <w:tcW w:type="dxa" w:w="6803"/>
-          </w:tcPr>
-          <w:p>
-            <w:r/>
-            <w:r>
-              <w:rPr>
-                <w:rFonts w:ascii="Times New Roman" w:hAnsi="Times New Roman"/>
-                <w:sz w:val="22"/>
-              </w:rPr>
-              <w:t>What is the discount amount?</w:t>
-            </w:r>
-          </w:p>
-        </w:tc>
-      </w:tr>
-      <w:tr>
-        <w:tc>
-          <w:tcPr>
-            <w:tcW w:type="dxa" w:w="2268"/>
-          </w:tcPr>
-          <w:p>
-            <w:r/>
-            <w:r>
-              <w:rPr>
-                <w:rFonts w:ascii="Times New Roman" w:hAnsi="Times New Roman"/>
-                <w:sz w:val="22"/>
-              </w:rPr>
-              <w:t>Discount_Rate</w:t>
-            </w:r>
-          </w:p>
-        </w:tc>
-        <w:tc>
-          <w:tcPr>
-            <w:tcW w:type="dxa" w:w="6803"/>
-          </w:tcPr>
-          <w:p>
-            <w:r/>
-            <w:r>
-              <w:rPr>
-                <w:rFonts w:ascii="Times New Roman" w:hAnsi="Times New Roman"/>
-                <w:sz w:val="22"/>
-              </w:rPr>
-              <w:t>What is the discount rate?</w:t>
             </w:r>
           </w:p>
         </w:tc>
@@ -6734,7 +6414,7 @@
         <w:pStyle w:val="ListBullet"/>
       </w:pPr>
       <w:r>
-        <w:t>Fields with stable anchor language (Due Date, Client Email, Client Phone) are recovered successfully when present in the document.</w:t>
+        <w:t>Fields with stable anchor language (Due Date, Invoice Date) are recovered successfully when clearly labelled in the document.</w:t>
       </w:r>
     </w:p>
     <w:p>
@@ -6742,7 +6422,7 @@
         <w:pStyle w:val="ListBullet"/>
       </w:pPr>
       <w:r>
-        <w:t>Fields whose position and formatting vary the most — Issuer Name, Client Name, Billing Address, Products — are recovered when the document's visual layout matches training-distribution patterns, and missed when it diverges significantly.</w:t>
+        <w:t>Fields whose position and formatting vary the most — Issuer Name, Recipient Name — are recovered when the document's visual layout matches training-distribution patterns, and missed when it diverges significantly.</w:t>
       </w:r>
     </w:p>
     <w:p>
@@ -7777,7 +7457,7 @@
     </w:p>
     <w:p>
       <w:r>
-        <w:t>DocLens demonstrates that the two requirements of the assignment brief — four-category document classification and structured invoice extraction — can be met in full without any generative AI component. The classifier achieves 93.8 percent validation accuracy on held-out data using nothing more exotic than TF-IDF, handcrafted visual features, and a soft-voting ensemble of classical models. The extractor recovers sixteen structured fields from real invoices using LayoutLMv2, a discriminative span-selection transformer that reads document text and spatial layout simultaneously.</w:t>
+        <w:t>DocLens demonstrates that the two requirements of the assignment brief — four-category document classification and structured invoice extraction — can be met in full without any generative AI component. The classifier achieves 93.8 percent validation accuracy on held-out data using nothing more exotic than TF-IDF, handcrafted visual features, and a soft-voting ensemble of classical models. The extractor recovers six structured fields from real invoices using LayoutLMv2, a discriminative span-selection transformer that reads document text and spatial layout simultaneously.</w:t>
       </w:r>
     </w:p>
     <w:p>
@@ -9058,7 +8738,7 @@
         <w:t xml:space="preserve">6.  </w:t>
       </w:r>
       <w:r>
-        <w:t>Click the document in the library to see the full classification distribution and (for invoices) the sixteen extracted fields.</w:t>
+        <w:t>Click the document in the library to see the full classification distribution and (for invoices) the six extracted fields.</w:t>
       </w:r>
     </w:p>
     <w:p>
@@ -9105,7 +8785,7 @@
         <w:br/>
         <w:t>#   Full-page OCR: N tokens extracted</w:t>
         <w:br/>
-        <w:t>#   LayoutLM answered X/16 fields: ['Invoice_Number', 'Invoice_Date', ...]</w:t>
+        <w:t>#   LayoutLM answered X/6 fields: ['Invoice_Number', 'Invoice_Date', ...]</w:t>
         <w:br/>
         <w:t>#   Extracted fields (merged): ...</w:t>
       </w:r>

</xml_diff>